<commit_message>
docs: formatting has been corrected
</commit_message>
<xml_diff>
--- a/Концепт-документ.docx
+++ b/Концепт-документ.docx
@@ -76,7 +76,25 @@
           <w:sz w:val="28"/>
           <w:szCs w:val="28"/>
         </w:rPr>
-        <w:t xml:space="preserve"> С простой регистрацией (телефон/email и пароль). Это нужно, чтобы клиент мог в любой момент зайти в свой личный кабинет и посмотреть историю броней.</w:t>
+        <w:t xml:space="preserve"> С простой регистрацией (телефон/</w:t>
+      </w:r>
+      <w:proofErr w:type="spellStart"/>
+      <w:r>
+        <w:rPr>
+          <w:rFonts w:cs="Courier New"/>
+          <w:sz w:val="28"/>
+          <w:szCs w:val="28"/>
+        </w:rPr>
+        <w:t>email</w:t>
+      </w:r>
+      <w:proofErr w:type="spellEnd"/>
+      <w:r>
+        <w:rPr>
+          <w:rFonts w:cs="Courier New"/>
+          <w:sz w:val="28"/>
+          <w:szCs w:val="28"/>
+        </w:rPr>
+        <w:t xml:space="preserve"> и пароль). Это нужно, чтобы клиент мог в любой момент зайти в свой личный кабинет и посмотреть историю броней.</w:t>
       </w:r>
     </w:p>
     <w:p>
@@ -251,15 +269,35 @@
           <w:sz w:val="28"/>
           <w:szCs w:val="28"/>
         </w:rPr>
-        <w:t>Ответ:</w:t>
-      </w:r>
-      <w:r>
-        <w:rPr>
-          <w:rFonts w:cs="Courier New"/>
-          <w:sz w:val="28"/>
-          <w:szCs w:val="28"/>
-        </w:rPr>
-        <w:t xml:space="preserve"> На </w:t>
+        <w:t>Ответ</w:t>
+      </w:r>
+      <w:proofErr w:type="gramStart"/>
+      <w:r>
+        <w:rPr>
+          <w:rFonts w:cs="Courier New"/>
+          <w:i/>
+          <w:iCs/>
+          <w:sz w:val="28"/>
+          <w:szCs w:val="28"/>
+        </w:rPr>
+        <w:t>:</w:t>
+      </w:r>
+      <w:r>
+        <w:rPr>
+          <w:rFonts w:cs="Courier New"/>
+          <w:sz w:val="28"/>
+          <w:szCs w:val="28"/>
+        </w:rPr>
+        <w:t xml:space="preserve"> На</w:t>
+      </w:r>
+      <w:proofErr w:type="gramEnd"/>
+      <w:r>
+        <w:rPr>
+          <w:rFonts w:cs="Courier New"/>
+          <w:sz w:val="28"/>
+          <w:szCs w:val="28"/>
+        </w:rPr>
+        <w:t xml:space="preserve"> </w:t>
       </w:r>
       <w:r>
         <w:rPr>
@@ -397,15 +435,35 @@
           <w:sz w:val="28"/>
           <w:szCs w:val="28"/>
         </w:rPr>
-        <w:t>Ответ:</w:t>
-      </w:r>
-      <w:r>
-        <w:rPr>
-          <w:rFonts w:cs="Courier New"/>
-          <w:sz w:val="28"/>
-          <w:szCs w:val="28"/>
-        </w:rPr>
-        <w:t xml:space="preserve"> Да, через личный кабинет, но не позднее чем за </w:t>
+        <w:t>Ответ</w:t>
+      </w:r>
+      <w:proofErr w:type="gramStart"/>
+      <w:r>
+        <w:rPr>
+          <w:rFonts w:cs="Courier New"/>
+          <w:i/>
+          <w:iCs/>
+          <w:sz w:val="28"/>
+          <w:szCs w:val="28"/>
+        </w:rPr>
+        <w:t>:</w:t>
+      </w:r>
+      <w:r>
+        <w:rPr>
+          <w:rFonts w:cs="Courier New"/>
+          <w:sz w:val="28"/>
+          <w:szCs w:val="28"/>
+        </w:rPr>
+        <w:t xml:space="preserve"> Да</w:t>
+      </w:r>
+      <w:proofErr w:type="gramEnd"/>
+      <w:r>
+        <w:rPr>
+          <w:rFonts w:cs="Courier New"/>
+          <w:sz w:val="28"/>
+          <w:szCs w:val="28"/>
+        </w:rPr>
+        <w:t xml:space="preserve">, через личный кабинет, но не позднее чем за </w:t>
       </w:r>
       <w:r>
         <w:rPr>
@@ -447,83 +505,6 @@
         </w:rPr>
         <w:lastRenderedPageBreak/>
         <w:t>Залы и расписание</w:t>
-      </w:r>
-    </w:p>
-    <w:p>
-      <w:pPr>
-        <w:spacing w:after="0" w:line="360" w:lineRule="auto"/>
-        <w:ind w:firstLine="709"/>
-        <w:jc w:val="both"/>
-        <w:rPr>
-          <w:rFonts w:cs="Courier New"/>
-          <w:sz w:val="28"/>
-          <w:szCs w:val="28"/>
-        </w:rPr>
-      </w:pPr>
-      <w:r>
-        <w:rPr>
-          <w:rFonts w:cs="Courier New"/>
-          <w:sz w:val="28"/>
-          <w:szCs w:val="28"/>
-        </w:rPr>
-        <w:t xml:space="preserve">7. </w:t>
-      </w:r>
-      <w:r>
-        <w:rPr>
-          <w:rFonts w:cs="Courier New"/>
-          <w:b/>
-          <w:bCs/>
-          <w:sz w:val="28"/>
-          <w:szCs w:val="28"/>
-        </w:rPr>
-        <w:t>Одинаковое ли у залов время работы? Есть ли выходные?</w:t>
-      </w:r>
-    </w:p>
-    <w:p>
-      <w:pPr>
-        <w:spacing w:after="0" w:line="360" w:lineRule="auto"/>
-        <w:jc w:val="both"/>
-        <w:rPr>
-          <w:rFonts w:cs="Courier New"/>
-          <w:sz w:val="28"/>
-          <w:szCs w:val="28"/>
-        </w:rPr>
-      </w:pPr>
-      <w:r>
-        <w:rPr>
-          <w:rFonts w:cs="Courier New"/>
-          <w:i/>
-          <w:iCs/>
-          <w:sz w:val="28"/>
-          <w:szCs w:val="28"/>
-        </w:rPr>
-        <w:t>Ответ:</w:t>
-      </w:r>
-      <w:r>
-        <w:rPr>
-          <w:rFonts w:cs="Courier New"/>
-          <w:sz w:val="28"/>
-          <w:szCs w:val="28"/>
-        </w:rPr>
-        <w:t xml:space="preserve"> Все 4 зала работают ежедневно с </w:t>
-      </w:r>
-      <w:r>
-        <w:rPr>
-          <w:rFonts w:cs="Courier New"/>
-          <w:b/>
-          <w:bCs/>
-          <w:sz w:val="28"/>
-          <w:szCs w:val="28"/>
-        </w:rPr>
-        <w:t>09:00 до 23:00</w:t>
-      </w:r>
-      <w:r>
-        <w:rPr>
-          <w:rFonts w:cs="Courier New"/>
-          <w:sz w:val="28"/>
-          <w:szCs w:val="28"/>
-        </w:rPr>
-        <w:t>, без выходных и праздников.</w:t>
       </w:r>
     </w:p>
     <w:p>
@@ -549,7 +530,7 @@
           <w:sz w:val="28"/>
           <w:szCs w:val="28"/>
         </w:rPr>
-        <w:t>Отличается ли цена по залам и времени суток? Нужно ли показывать стоимость на сайте?</w:t>
+        <w:t>Одинаковое ли у залов время работы? Есть ли выходные?</w:t>
       </w:r>
     </w:p>
     <w:p>
@@ -570,16 +551,9 @@
           <w:sz w:val="28"/>
           <w:szCs w:val="28"/>
         </w:rPr>
-        <w:t>Ответ:</w:t>
-      </w:r>
-      <w:r>
-        <w:rPr>
-          <w:rFonts w:cs="Courier New"/>
-          <w:sz w:val="28"/>
-          <w:szCs w:val="28"/>
-        </w:rPr>
-        <w:t xml:space="preserve"> Цены отличаются по залам (фиксированные ставки за час: </w:t>
-      </w:r>
+        <w:t>Ответ</w:t>
+      </w:r>
+      <w:proofErr w:type="gramStart"/>
       <w:r>
         <w:rPr>
           <w:rFonts w:cs="Courier New"/>
@@ -588,69 +562,42 @@
           <w:sz w:val="28"/>
           <w:szCs w:val="28"/>
         </w:rPr>
-        <w:t>Циклорама — 2000 ₽</w:t>
-      </w:r>
-      <w:r>
-        <w:rPr>
-          <w:rFonts w:cs="Courier New"/>
-          <w:sz w:val="28"/>
-          <w:szCs w:val="28"/>
-        </w:rPr>
-        <w:t xml:space="preserve">, </w:t>
-      </w:r>
-      <w:r>
-        <w:rPr>
-          <w:rFonts w:cs="Courier New"/>
-          <w:i/>
-          <w:iCs/>
-          <w:sz w:val="28"/>
-          <w:szCs w:val="28"/>
-        </w:rPr>
-        <w:t>Лофт — 2500 ₽</w:t>
-      </w:r>
-      <w:r>
-        <w:rPr>
-          <w:rFonts w:cs="Courier New"/>
-          <w:sz w:val="28"/>
-          <w:szCs w:val="28"/>
-        </w:rPr>
-        <w:t xml:space="preserve">, </w:t>
-      </w:r>
-      <w:r>
-        <w:rPr>
-          <w:rFonts w:cs="Courier New"/>
-          <w:i/>
-          <w:iCs/>
-          <w:sz w:val="28"/>
-          <w:szCs w:val="28"/>
-        </w:rPr>
-        <w:t>Неон — 1800 ₽</w:t>
-      </w:r>
-      <w:r>
-        <w:rPr>
-          <w:rFonts w:cs="Courier New"/>
-          <w:sz w:val="28"/>
-          <w:szCs w:val="28"/>
-        </w:rPr>
-        <w:t xml:space="preserve">, </w:t>
-      </w:r>
-      <w:r>
-        <w:rPr>
-          <w:rFonts w:cs="Courier New"/>
-          <w:i/>
-          <w:iCs/>
-          <w:sz w:val="28"/>
-          <w:szCs w:val="28"/>
-        </w:rPr>
-        <w:t>Сканди — 2200 ₽</w:t>
-      </w:r>
-      <w:r>
-        <w:rPr>
-          <w:rFonts w:cs="Courier New"/>
-          <w:sz w:val="28"/>
-          <w:szCs w:val="28"/>
-        </w:rPr>
-        <w:t>). Разделения на день/ночь в MVP нет. Цену за час и итоговую сумму обязательно показывать на карточке зала и при выборе слотов.</w:t>
+        <w:t>:</w:t>
+      </w:r>
+      <w:r>
+        <w:rPr>
+          <w:rFonts w:cs="Courier New"/>
+          <w:sz w:val="28"/>
+          <w:szCs w:val="28"/>
+        </w:rPr>
+        <w:t xml:space="preserve"> Все</w:t>
+      </w:r>
+      <w:proofErr w:type="gramEnd"/>
+      <w:r>
+        <w:rPr>
+          <w:rFonts w:cs="Courier New"/>
+          <w:sz w:val="28"/>
+          <w:szCs w:val="28"/>
+        </w:rPr>
+        <w:t xml:space="preserve"> 4 зала работают ежедневно с </w:t>
+      </w:r>
+      <w:r>
+        <w:rPr>
+          <w:rFonts w:cs="Courier New"/>
+          <w:b/>
+          <w:bCs/>
+          <w:sz w:val="28"/>
+          <w:szCs w:val="28"/>
+        </w:rPr>
+        <w:t>09:00 до 23:00</w:t>
+      </w:r>
+      <w:r>
+        <w:rPr>
+          <w:rFonts w:cs="Courier New"/>
+          <w:sz w:val="28"/>
+          <w:szCs w:val="28"/>
+        </w:rPr>
+        <w:t>, без выходных и праздников.</w:t>
       </w:r>
     </w:p>
     <w:p>
@@ -676,7 +623,7 @@
           <w:sz w:val="28"/>
           <w:szCs w:val="28"/>
         </w:rPr>
-        <w:t>Можно ли забронировать сразу несколько залов на одно время?</w:t>
+        <w:t>Отличается ли цена по залам и времени суток? Нужно ли показывать стоимость на сайте?</w:t>
       </w:r>
     </w:p>
     <w:p>
@@ -705,49 +652,8 @@
           <w:sz w:val="28"/>
           <w:szCs w:val="28"/>
         </w:rPr>
-        <w:t xml:space="preserve"> В рамках одной транзакции бронируется один зал. Если клиенту нужно два зала одновременно (например, гримерка/лофт + циклорама), он оформляет две отдельные брони.</w:t>
-      </w:r>
-    </w:p>
-    <w:p>
-      <w:pPr>
-        <w:spacing w:after="0" w:line="360" w:lineRule="auto"/>
-        <w:ind w:firstLine="708"/>
-        <w:jc w:val="both"/>
-        <w:rPr>
-          <w:rFonts w:cs="Courier New"/>
-          <w:sz w:val="28"/>
-          <w:szCs w:val="28"/>
-        </w:rPr>
-      </w:pPr>
-      <w:r>
-        <w:rPr>
-          <w:rFonts w:cs="Courier New"/>
-          <w:sz w:val="28"/>
-          <w:szCs w:val="28"/>
-        </w:rPr>
-        <w:t xml:space="preserve">10. </w:t>
-      </w:r>
-      <w:r>
-        <w:rPr>
-          <w:rFonts w:cs="Courier New"/>
-          <w:b/>
-          <w:bCs/>
-          <w:sz w:val="28"/>
-          <w:szCs w:val="28"/>
-        </w:rPr>
-        <w:t>Есть ли дополнительные услуги к брони (фотограф, оборудование, гримёрка)?</w:t>
-      </w:r>
-    </w:p>
-    <w:p>
-      <w:pPr>
-        <w:spacing w:after="0" w:line="360" w:lineRule="auto"/>
-        <w:jc w:val="both"/>
-        <w:rPr>
-          <w:rFonts w:cs="Courier New"/>
-          <w:sz w:val="28"/>
-          <w:szCs w:val="28"/>
-        </w:rPr>
-      </w:pPr>
+        <w:t xml:space="preserve"> Цены отличаются по залам (фиксированные ставки за час: </w:t>
+      </w:r>
       <w:r>
         <w:rPr>
           <w:rFonts w:cs="Courier New"/>
@@ -756,81 +662,16 @@
           <w:sz w:val="28"/>
           <w:szCs w:val="28"/>
         </w:rPr>
-        <w:t>Ответ:</w:t>
-      </w:r>
-      <w:r>
-        <w:rPr>
-          <w:rFonts w:cs="Courier New"/>
-          <w:sz w:val="28"/>
-          <w:szCs w:val="28"/>
-        </w:rPr>
-        <w:t xml:space="preserve"> В MVP все пожелания по доп. оборудованию и аренде источников света клиент указывает текстовой строкой в поле «Комментарий к бронированию». Отдельного каталога оборудования пока не требуется.</w:t>
-      </w:r>
-    </w:p>
-    <w:p>
-      <w:pPr>
-        <w:spacing w:after="0" w:line="360" w:lineRule="auto"/>
-        <w:ind w:firstLine="709"/>
-        <w:jc w:val="both"/>
-        <w:rPr>
-          <w:rFonts w:cs="Courier New"/>
-          <w:b/>
-          <w:bCs/>
-          <w:sz w:val="28"/>
-          <w:szCs w:val="28"/>
-        </w:rPr>
-      </w:pPr>
-      <w:r>
-        <w:rPr>
-          <w:rFonts w:cs="Courier New"/>
-          <w:b/>
-          <w:bCs/>
-          <w:sz w:val="28"/>
-          <w:szCs w:val="28"/>
-        </w:rPr>
-        <w:t>Администратор</w:t>
-      </w:r>
-    </w:p>
-    <w:p>
-      <w:pPr>
-        <w:spacing w:after="0" w:line="360" w:lineRule="auto"/>
-        <w:ind w:firstLine="709"/>
-        <w:jc w:val="both"/>
-        <w:rPr>
-          <w:rFonts w:cs="Courier New"/>
-          <w:sz w:val="28"/>
-          <w:szCs w:val="28"/>
-        </w:rPr>
-      </w:pPr>
-      <w:r>
-        <w:rPr>
-          <w:rFonts w:cs="Courier New"/>
-          <w:sz w:val="28"/>
-          <w:szCs w:val="28"/>
-        </w:rPr>
-        <w:t xml:space="preserve">11. </w:t>
-      </w:r>
-      <w:r>
-        <w:rPr>
-          <w:rFonts w:cs="Courier New"/>
-          <w:b/>
-          <w:bCs/>
-          <w:sz w:val="28"/>
-          <w:szCs w:val="28"/>
-        </w:rPr>
-        <w:t>Сколько администраторов? Нужны ли разные права (например, владелец и администратор)?</w:t>
-      </w:r>
-    </w:p>
-    <w:p>
-      <w:pPr>
-        <w:spacing w:after="0" w:line="360" w:lineRule="auto"/>
-        <w:jc w:val="both"/>
-        <w:rPr>
-          <w:rFonts w:cs="Courier New"/>
-          <w:sz w:val="28"/>
-          <w:szCs w:val="28"/>
-        </w:rPr>
-      </w:pPr>
+        <w:t>Циклорама — 2000 ₽</w:t>
+      </w:r>
+      <w:r>
+        <w:rPr>
+          <w:rFonts w:cs="Courier New"/>
+          <w:sz w:val="28"/>
+          <w:szCs w:val="28"/>
+        </w:rPr>
+        <w:t xml:space="preserve">, </w:t>
+      </w:r>
       <w:r>
         <w:rPr>
           <w:rFonts w:cs="Courier New"/>
@@ -839,57 +680,16 @@
           <w:sz w:val="28"/>
           <w:szCs w:val="28"/>
         </w:rPr>
-        <w:t>Ответ:</w:t>
-      </w:r>
-      <w:r>
-        <w:rPr>
-          <w:rFonts w:cs="Courier New"/>
-          <w:sz w:val="28"/>
-          <w:szCs w:val="28"/>
-        </w:rPr>
-        <w:t xml:space="preserve"> Достаточно двух ролей: «Клиент» и единая роль «Администратор» (с полным доступом к сетке броней всех 4 залов).</w:t>
-      </w:r>
-    </w:p>
-    <w:p>
-      <w:pPr>
-        <w:spacing w:after="0" w:line="360" w:lineRule="auto"/>
-        <w:ind w:firstLine="708"/>
-        <w:jc w:val="both"/>
-        <w:rPr>
-          <w:rFonts w:cs="Courier New"/>
-          <w:sz w:val="28"/>
-          <w:szCs w:val="28"/>
-        </w:rPr>
-      </w:pPr>
-      <w:r>
-        <w:rPr>
-          <w:rFonts w:cs="Courier New"/>
-          <w:sz w:val="28"/>
-          <w:szCs w:val="28"/>
-        </w:rPr>
-        <w:t xml:space="preserve">12. </w:t>
-      </w:r>
-      <w:r>
-        <w:rPr>
-          <w:rFonts w:cs="Courier New"/>
-          <w:b/>
-          <w:bCs/>
-          <w:sz w:val="28"/>
-          <w:szCs w:val="28"/>
-        </w:rPr>
-        <w:t>Заявки из Telegram, VK и звонков администратор вносит в систему вручную? Автоматическая интеграция не нужна?</w:t>
-      </w:r>
-    </w:p>
-    <w:p>
-      <w:pPr>
-        <w:spacing w:after="0" w:line="360" w:lineRule="auto"/>
-        <w:jc w:val="both"/>
-        <w:rPr>
-          <w:rFonts w:cs="Courier New"/>
-          <w:sz w:val="28"/>
-          <w:szCs w:val="28"/>
-        </w:rPr>
-      </w:pPr>
+        <w:t>Лофт — 2500 ₽</w:t>
+      </w:r>
+      <w:r>
+        <w:rPr>
+          <w:rFonts w:cs="Courier New"/>
+          <w:sz w:val="28"/>
+          <w:szCs w:val="28"/>
+        </w:rPr>
+        <w:t xml:space="preserve">, </w:t>
+      </w:r>
       <w:r>
         <w:rPr>
           <w:rFonts w:cs="Courier New"/>
@@ -898,6 +698,154 @@
           <w:sz w:val="28"/>
           <w:szCs w:val="28"/>
         </w:rPr>
+        <w:t>Неон — 1800 ₽</w:t>
+      </w:r>
+      <w:r>
+        <w:rPr>
+          <w:rFonts w:cs="Courier New"/>
+          <w:sz w:val="28"/>
+          <w:szCs w:val="28"/>
+        </w:rPr>
+        <w:t xml:space="preserve">, </w:t>
+      </w:r>
+      <w:r>
+        <w:rPr>
+          <w:rFonts w:cs="Courier New"/>
+          <w:i/>
+          <w:iCs/>
+          <w:sz w:val="28"/>
+          <w:szCs w:val="28"/>
+        </w:rPr>
+        <w:t>Сканди — 2200 ₽</w:t>
+      </w:r>
+      <w:r>
+        <w:rPr>
+          <w:rFonts w:cs="Courier New"/>
+          <w:sz w:val="28"/>
+          <w:szCs w:val="28"/>
+        </w:rPr>
+        <w:t>). Разделения на день/ночь в MVP нет. Цену за час и итоговую сумму обязательно показывать на карточке зала и при выборе слотов.</w:t>
+      </w:r>
+    </w:p>
+    <w:p>
+      <w:pPr>
+        <w:pStyle w:val="a7"/>
+        <w:numPr>
+          <w:ilvl w:val="0"/>
+          <w:numId w:val="2"/>
+        </w:numPr>
+        <w:spacing w:after="0" w:line="360" w:lineRule="auto"/>
+        <w:jc w:val="both"/>
+        <w:rPr>
+          <w:rFonts w:cs="Courier New"/>
+          <w:sz w:val="28"/>
+          <w:szCs w:val="28"/>
+        </w:rPr>
+      </w:pPr>
+      <w:r>
+        <w:rPr>
+          <w:rFonts w:cs="Courier New"/>
+          <w:b/>
+          <w:bCs/>
+          <w:sz w:val="28"/>
+          <w:szCs w:val="28"/>
+        </w:rPr>
+        <w:t>Можно ли забронировать сразу несколько залов на одно время?</w:t>
+      </w:r>
+    </w:p>
+    <w:p>
+      <w:pPr>
+        <w:spacing w:after="0" w:line="360" w:lineRule="auto"/>
+        <w:jc w:val="both"/>
+        <w:rPr>
+          <w:rFonts w:cs="Courier New"/>
+          <w:sz w:val="28"/>
+          <w:szCs w:val="28"/>
+        </w:rPr>
+      </w:pPr>
+      <w:r>
+        <w:rPr>
+          <w:rFonts w:cs="Courier New"/>
+          <w:i/>
+          <w:iCs/>
+          <w:sz w:val="28"/>
+          <w:szCs w:val="28"/>
+        </w:rPr>
+        <w:t>Ответ</w:t>
+      </w:r>
+      <w:proofErr w:type="gramStart"/>
+      <w:r>
+        <w:rPr>
+          <w:rFonts w:cs="Courier New"/>
+          <w:i/>
+          <w:iCs/>
+          <w:sz w:val="28"/>
+          <w:szCs w:val="28"/>
+        </w:rPr>
+        <w:t>:</w:t>
+      </w:r>
+      <w:r>
+        <w:rPr>
+          <w:rFonts w:cs="Courier New"/>
+          <w:sz w:val="28"/>
+          <w:szCs w:val="28"/>
+        </w:rPr>
+        <w:t xml:space="preserve"> В рамках</w:t>
+      </w:r>
+      <w:proofErr w:type="gramEnd"/>
+      <w:r>
+        <w:rPr>
+          <w:rFonts w:cs="Courier New"/>
+          <w:sz w:val="28"/>
+          <w:szCs w:val="28"/>
+        </w:rPr>
+        <w:t xml:space="preserve"> одной транзакции бронируется один зал. Если клиенту нужно два зала одновременно (например, гримерка/лофт + циклорама), он оформляет две отдельные брони.</w:t>
+      </w:r>
+    </w:p>
+    <w:p>
+      <w:pPr>
+        <w:pStyle w:val="a7"/>
+        <w:numPr>
+          <w:ilvl w:val="0"/>
+          <w:numId w:val="2"/>
+        </w:numPr>
+        <w:spacing w:after="0" w:line="360" w:lineRule="auto"/>
+        <w:jc w:val="both"/>
+        <w:rPr>
+          <w:rFonts w:cs="Courier New"/>
+          <w:sz w:val="28"/>
+          <w:szCs w:val="28"/>
+        </w:rPr>
+      </w:pPr>
+      <w:r>
+        <w:rPr>
+          <w:rFonts w:cs="Courier New"/>
+          <w:b/>
+          <w:bCs/>
+          <w:sz w:val="28"/>
+          <w:szCs w:val="28"/>
+        </w:rPr>
+        <w:t>Есть ли дополнительные услуги к брони (фотограф, оборудование, гримёрка)?</w:t>
+      </w:r>
+    </w:p>
+    <w:p>
+      <w:pPr>
+        <w:spacing w:after="0" w:line="360" w:lineRule="auto"/>
+        <w:jc w:val="both"/>
+        <w:rPr>
+          <w:rFonts w:cs="Courier New"/>
+          <w:sz w:val="28"/>
+          <w:szCs w:val="28"/>
+        </w:rPr>
+      </w:pPr>
+      <w:r>
+        <w:rPr>
+          <w:rFonts w:cs="Courier New"/>
+          <w:i/>
+          <w:iCs/>
+          <w:sz w:val="28"/>
+          <w:szCs w:val="28"/>
+        </w:rPr>
         <w:t>Ответ:</w:t>
       </w:r>
       <w:r>
@@ -906,7 +854,181 @@
           <w:sz w:val="28"/>
           <w:szCs w:val="28"/>
         </w:rPr>
-        <w:t xml:space="preserve"> Да, администратор просто открывает свой экран расписания, нажимает нужный свободный слот и вручную вбивает имя и телефон </w:t>
+        <w:t xml:space="preserve"> В MVP все пожелания по доп. оборудованию и аренде источников света клиент указывает текстовой строкой в поле «Комментарий к бронированию». Отдельного каталога оборудования пока не требуется.</w:t>
+      </w:r>
+    </w:p>
+    <w:p>
+      <w:pPr>
+        <w:spacing w:after="0" w:line="360" w:lineRule="auto"/>
+        <w:ind w:firstLine="709"/>
+        <w:jc w:val="both"/>
+        <w:rPr>
+          <w:rFonts w:cs="Courier New"/>
+          <w:b/>
+          <w:bCs/>
+          <w:sz w:val="28"/>
+          <w:szCs w:val="28"/>
+        </w:rPr>
+      </w:pPr>
+      <w:r>
+        <w:rPr>
+          <w:rFonts w:cs="Courier New"/>
+          <w:b/>
+          <w:bCs/>
+          <w:sz w:val="28"/>
+          <w:szCs w:val="28"/>
+        </w:rPr>
+        <w:t>Администратор</w:t>
+      </w:r>
+    </w:p>
+    <w:p>
+      <w:pPr>
+        <w:pStyle w:val="a7"/>
+        <w:numPr>
+          <w:ilvl w:val="0"/>
+          <w:numId w:val="2"/>
+        </w:numPr>
+        <w:spacing w:after="0" w:line="360" w:lineRule="auto"/>
+        <w:jc w:val="both"/>
+        <w:rPr>
+          <w:rFonts w:cs="Courier New"/>
+          <w:sz w:val="28"/>
+          <w:szCs w:val="28"/>
+        </w:rPr>
+      </w:pPr>
+      <w:r>
+        <w:rPr>
+          <w:rFonts w:cs="Courier New"/>
+          <w:b/>
+          <w:bCs/>
+          <w:sz w:val="28"/>
+          <w:szCs w:val="28"/>
+        </w:rPr>
+        <w:t>Сколько администраторов? Нужны ли разные права (например, владелец и администратор)?</w:t>
+      </w:r>
+    </w:p>
+    <w:p>
+      <w:pPr>
+        <w:spacing w:after="0" w:line="360" w:lineRule="auto"/>
+        <w:jc w:val="both"/>
+        <w:rPr>
+          <w:rFonts w:cs="Courier New"/>
+          <w:sz w:val="28"/>
+          <w:szCs w:val="28"/>
+        </w:rPr>
+      </w:pPr>
+      <w:r>
+        <w:rPr>
+          <w:rFonts w:cs="Courier New"/>
+          <w:i/>
+          <w:iCs/>
+          <w:sz w:val="28"/>
+          <w:szCs w:val="28"/>
+        </w:rPr>
+        <w:t>Ответ</w:t>
+      </w:r>
+      <w:proofErr w:type="gramStart"/>
+      <w:r>
+        <w:rPr>
+          <w:rFonts w:cs="Courier New"/>
+          <w:i/>
+          <w:iCs/>
+          <w:sz w:val="28"/>
+          <w:szCs w:val="28"/>
+        </w:rPr>
+        <w:t>:</w:t>
+      </w:r>
+      <w:r>
+        <w:rPr>
+          <w:rFonts w:cs="Courier New"/>
+          <w:sz w:val="28"/>
+          <w:szCs w:val="28"/>
+        </w:rPr>
+        <w:t xml:space="preserve"> Достаточно</w:t>
+      </w:r>
+      <w:proofErr w:type="gramEnd"/>
+      <w:r>
+        <w:rPr>
+          <w:rFonts w:cs="Courier New"/>
+          <w:sz w:val="28"/>
+          <w:szCs w:val="28"/>
+        </w:rPr>
+        <w:t xml:space="preserve"> двух ролей: «Клиент» и единая роль «Администратор» (с полным доступом к сетке броней всех 4 залов).</w:t>
+      </w:r>
+    </w:p>
+    <w:p>
+      <w:pPr>
+        <w:pStyle w:val="a7"/>
+        <w:numPr>
+          <w:ilvl w:val="0"/>
+          <w:numId w:val="2"/>
+        </w:numPr>
+        <w:spacing w:after="0" w:line="360" w:lineRule="auto"/>
+        <w:jc w:val="both"/>
+        <w:rPr>
+          <w:rFonts w:cs="Courier New"/>
+          <w:sz w:val="28"/>
+          <w:szCs w:val="28"/>
+        </w:rPr>
+      </w:pPr>
+      <w:r>
+        <w:rPr>
+          <w:rFonts w:cs="Courier New"/>
+          <w:b/>
+          <w:bCs/>
+          <w:sz w:val="28"/>
+          <w:szCs w:val="28"/>
+        </w:rPr>
+        <w:t>Заявки из Telegram, VK и звонков администратор вносит в систему вручную? Автоматическая интеграция не нужна?</w:t>
+      </w:r>
+    </w:p>
+    <w:p>
+      <w:pPr>
+        <w:spacing w:after="0" w:line="360" w:lineRule="auto"/>
+        <w:jc w:val="both"/>
+        <w:rPr>
+          <w:rFonts w:cs="Courier New"/>
+          <w:sz w:val="28"/>
+          <w:szCs w:val="28"/>
+        </w:rPr>
+      </w:pPr>
+      <w:r>
+        <w:rPr>
+          <w:rFonts w:cs="Courier New"/>
+          <w:i/>
+          <w:iCs/>
+          <w:sz w:val="28"/>
+          <w:szCs w:val="28"/>
+        </w:rPr>
+        <w:t>Ответ</w:t>
+      </w:r>
+      <w:proofErr w:type="gramStart"/>
+      <w:r>
+        <w:rPr>
+          <w:rFonts w:cs="Courier New"/>
+          <w:i/>
+          <w:iCs/>
+          <w:sz w:val="28"/>
+          <w:szCs w:val="28"/>
+        </w:rPr>
+        <w:t>:</w:t>
+      </w:r>
+      <w:r>
+        <w:rPr>
+          <w:rFonts w:cs="Courier New"/>
+          <w:sz w:val="28"/>
+          <w:szCs w:val="28"/>
+        </w:rPr>
+        <w:t xml:space="preserve"> Да</w:t>
+      </w:r>
+      <w:proofErr w:type="gramEnd"/>
+      <w:r>
+        <w:rPr>
+          <w:rFonts w:cs="Courier New"/>
+          <w:sz w:val="28"/>
+          <w:szCs w:val="28"/>
+        </w:rPr>
+        <w:t xml:space="preserve">, администратор просто открывает свой экран расписания, нажимает нужный свободный слот и вручную вбивает имя и телефон </w:t>
       </w:r>
       <w:r>
         <w:rPr>
@@ -920,32 +1042,50 @@
     </w:p>
     <w:p>
       <w:pPr>
-        <w:spacing w:after="0" w:line="360" w:lineRule="auto"/>
-        <w:ind w:firstLine="708"/>
-        <w:jc w:val="both"/>
-        <w:rPr>
-          <w:rFonts w:cs="Courier New"/>
-          <w:sz w:val="28"/>
-          <w:szCs w:val="28"/>
-        </w:rPr>
-      </w:pPr>
-      <w:r>
-        <w:rPr>
-          <w:rFonts w:cs="Courier New"/>
-          <w:sz w:val="28"/>
-          <w:szCs w:val="28"/>
-        </w:rPr>
-        <w:t xml:space="preserve">13. </w:t>
-      </w:r>
-      <w:r>
-        <w:rPr>
-          <w:rFonts w:cs="Courier New"/>
-          <w:b/>
-          <w:bCs/>
-          <w:sz w:val="28"/>
-          <w:szCs w:val="28"/>
-        </w:rPr>
-        <w:t>Что делать с уже существующими бронями из текущего календаря: переносить или начать с чистого листа?</w:t>
+        <w:pStyle w:val="a7"/>
+        <w:numPr>
+          <w:ilvl w:val="0"/>
+          <w:numId w:val="2"/>
+        </w:numPr>
+        <w:spacing w:after="0" w:line="360" w:lineRule="auto"/>
+        <w:jc w:val="both"/>
+        <w:rPr>
+          <w:rFonts w:cs="Courier New"/>
+          <w:sz w:val="28"/>
+          <w:szCs w:val="28"/>
+        </w:rPr>
+      </w:pPr>
+      <w:r>
+        <w:rPr>
+          <w:rFonts w:cs="Courier New"/>
+          <w:b/>
+          <w:bCs/>
+          <w:sz w:val="28"/>
+          <w:szCs w:val="28"/>
+        </w:rPr>
+        <w:t xml:space="preserve">Что делать с </w:t>
+      </w:r>
+      <w:proofErr w:type="gramStart"/>
+      <w:r>
+        <w:rPr>
+          <w:rFonts w:cs="Courier New"/>
+          <w:b/>
+          <w:bCs/>
+          <w:sz w:val="28"/>
+          <w:szCs w:val="28"/>
+        </w:rPr>
+        <w:t>уже существующими</w:t>
+      </w:r>
+      <w:proofErr w:type="gramEnd"/>
+      <w:r>
+        <w:rPr>
+          <w:rFonts w:cs="Courier New"/>
+          <w:b/>
+          <w:bCs/>
+          <w:sz w:val="28"/>
+          <w:szCs w:val="28"/>
+        </w:rPr>
+        <w:t xml:space="preserve"> бронями из текущего календаря: переносить или начать с чистого листа?</w:t>
       </w:r>
     </w:p>
     <w:p>
@@ -966,79 +1106,9 @@
           <w:sz w:val="28"/>
           <w:szCs w:val="28"/>
         </w:rPr>
-        <w:t>Ответ:</w:t>
-      </w:r>
-      <w:r>
-        <w:rPr>
-          <w:rFonts w:cs="Courier New"/>
-          <w:sz w:val="28"/>
-          <w:szCs w:val="28"/>
-        </w:rPr>
-        <w:t xml:space="preserve"> Начать с чистого листа, но наполнить систему правдоподобными тестовыми данными (демо-расписанием на ближайшую неделю).</w:t>
-      </w:r>
-    </w:p>
-    <w:p>
-      <w:pPr>
-        <w:spacing w:after="0" w:line="360" w:lineRule="auto"/>
-        <w:ind w:firstLine="709"/>
-        <w:jc w:val="both"/>
-        <w:rPr>
-          <w:rFonts w:cs="Courier New"/>
-          <w:sz w:val="28"/>
-          <w:szCs w:val="28"/>
-        </w:rPr>
-      </w:pPr>
-      <w:r>
-        <w:rPr>
-          <w:rFonts w:cs="Courier New"/>
-          <w:b/>
-          <w:bCs/>
-          <w:sz w:val="28"/>
-          <w:szCs w:val="28"/>
-        </w:rPr>
-        <w:t>Оплата и уведомления</w:t>
-      </w:r>
-    </w:p>
-    <w:p>
-      <w:pPr>
-        <w:spacing w:after="0" w:line="360" w:lineRule="auto"/>
-        <w:ind w:firstLine="709"/>
-        <w:jc w:val="both"/>
-        <w:rPr>
-          <w:rFonts w:cs="Courier New"/>
-          <w:sz w:val="28"/>
-          <w:szCs w:val="28"/>
-        </w:rPr>
-      </w:pPr>
-      <w:r>
-        <w:rPr>
-          <w:rFonts w:cs="Courier New"/>
-          <w:sz w:val="28"/>
-          <w:szCs w:val="28"/>
-        </w:rPr>
-        <w:t xml:space="preserve">14. </w:t>
-      </w:r>
-      <w:r>
-        <w:rPr>
-          <w:rFonts w:cs="Courier New"/>
-          <w:b/>
-          <w:bCs/>
-          <w:sz w:val="28"/>
-          <w:szCs w:val="28"/>
-        </w:rPr>
-        <w:t>Нужна ли предоплата при бронировании?</w:t>
-      </w:r>
-    </w:p>
-    <w:p>
-      <w:pPr>
-        <w:spacing w:after="0" w:line="360" w:lineRule="auto"/>
-        <w:jc w:val="both"/>
-        <w:rPr>
-          <w:rFonts w:cs="Courier New"/>
-          <w:sz w:val="28"/>
-          <w:szCs w:val="28"/>
-        </w:rPr>
-      </w:pPr>
+        <w:t>Ответ</w:t>
+      </w:r>
+      <w:proofErr w:type="gramStart"/>
       <w:r>
         <w:rPr>
           <w:rFonts w:cs="Courier New"/>
@@ -1047,63 +1117,72 @@
           <w:sz w:val="28"/>
           <w:szCs w:val="28"/>
         </w:rPr>
-        <w:t>Ответ:</w:t>
-      </w:r>
-      <w:r>
-        <w:rPr>
-          <w:rFonts w:cs="Courier New"/>
-          <w:sz w:val="28"/>
-          <w:szCs w:val="28"/>
-        </w:rPr>
-        <w:t xml:space="preserve"> Да, требуется 100% предоплата. В учебном прототипе делаем </w:t>
-      </w:r>
-      <w:r>
-        <w:rPr>
-          <w:rFonts w:cs="Courier New"/>
-          <w:b/>
-          <w:bCs/>
-          <w:sz w:val="28"/>
-          <w:szCs w:val="28"/>
-        </w:rPr>
-        <w:t>кнопку-заглушку «Оплатить»</w:t>
-      </w:r>
-      <w:r>
-        <w:rPr>
-          <w:rFonts w:cs="Courier New"/>
-          <w:sz w:val="28"/>
-          <w:szCs w:val="28"/>
-        </w:rPr>
-        <w:t>, которая моментально переводит бронь в статус «Оплачено».</w:t>
-      </w:r>
-    </w:p>
-    <w:p>
-      <w:pPr>
-        <w:spacing w:after="0" w:line="360" w:lineRule="auto"/>
-        <w:ind w:firstLine="708"/>
-        <w:jc w:val="both"/>
-        <w:rPr>
-          <w:rFonts w:cs="Courier New"/>
-          <w:sz w:val="28"/>
-          <w:szCs w:val="28"/>
-        </w:rPr>
-      </w:pPr>
-      <w:r>
-        <w:rPr>
-          <w:rFonts w:cs="Courier New"/>
-          <w:sz w:val="28"/>
-          <w:szCs w:val="28"/>
-        </w:rPr>
-        <w:t xml:space="preserve">15. </w:t>
-      </w:r>
-      <w:r>
-        <w:rPr>
-          <w:rFonts w:cs="Courier New"/>
-          <w:b/>
-          <w:bCs/>
-          <w:sz w:val="28"/>
-          <w:szCs w:val="28"/>
-        </w:rPr>
-        <w:t>Нужно ли уведомлять клиента о брони и напоминать о ней? Каким каналом: SMS, Telegram, email?</w:t>
+        <w:t>:</w:t>
+      </w:r>
+      <w:r>
+        <w:rPr>
+          <w:rFonts w:cs="Courier New"/>
+          <w:sz w:val="28"/>
+          <w:szCs w:val="28"/>
+        </w:rPr>
+        <w:t xml:space="preserve"> Начать</w:t>
+      </w:r>
+      <w:proofErr w:type="gramEnd"/>
+      <w:r>
+        <w:rPr>
+          <w:rFonts w:cs="Courier New"/>
+          <w:sz w:val="28"/>
+          <w:szCs w:val="28"/>
+        </w:rPr>
+        <w:t xml:space="preserve"> с чистого листа, но наполнить систему правдоподобными тестовыми данными (демо-расписанием на ближайшую неделю).</w:t>
+      </w:r>
+    </w:p>
+    <w:p>
+      <w:pPr>
+        <w:spacing w:after="0" w:line="360" w:lineRule="auto"/>
+        <w:ind w:firstLine="709"/>
+        <w:jc w:val="both"/>
+        <w:rPr>
+          <w:rFonts w:cs="Courier New"/>
+          <w:sz w:val="28"/>
+          <w:szCs w:val="28"/>
+        </w:rPr>
+      </w:pPr>
+      <w:r>
+        <w:rPr>
+          <w:rFonts w:cs="Courier New"/>
+          <w:b/>
+          <w:bCs/>
+          <w:sz w:val="28"/>
+          <w:szCs w:val="28"/>
+        </w:rPr>
+        <w:t>Оплата и уведомления</w:t>
+      </w:r>
+    </w:p>
+    <w:p>
+      <w:pPr>
+        <w:pStyle w:val="a7"/>
+        <w:numPr>
+          <w:ilvl w:val="0"/>
+          <w:numId w:val="2"/>
+        </w:numPr>
+        <w:spacing w:after="0" w:line="360" w:lineRule="auto"/>
+        <w:jc w:val="both"/>
+        <w:rPr>
+          <w:rFonts w:cs="Courier New"/>
+          <w:sz w:val="28"/>
+          <w:szCs w:val="28"/>
+        </w:rPr>
+      </w:pPr>
+      <w:r>
+        <w:rPr>
+          <w:rFonts w:cs="Courier New"/>
+          <w:b/>
+          <w:bCs/>
+          <w:sz w:val="28"/>
+          <w:szCs w:val="28"/>
+        </w:rPr>
+        <w:t>Нужна ли предоплата при бронировании?</w:t>
       </w:r>
     </w:p>
     <w:p>
@@ -1124,15 +1203,183 @@
           <w:sz w:val="28"/>
           <w:szCs w:val="28"/>
         </w:rPr>
-        <w:t>Ответ:</w:t>
-      </w:r>
-      <w:r>
-        <w:rPr>
-          <w:rFonts w:cs="Courier New"/>
-          <w:sz w:val="28"/>
-          <w:szCs w:val="28"/>
-        </w:rPr>
-        <w:t xml:space="preserve"> Да, уведомления нужны, но делаем </w:t>
+        <w:t>Ответ</w:t>
+      </w:r>
+      <w:proofErr w:type="gramStart"/>
+      <w:r>
+        <w:rPr>
+          <w:rFonts w:cs="Courier New"/>
+          <w:i/>
+          <w:iCs/>
+          <w:sz w:val="28"/>
+          <w:szCs w:val="28"/>
+        </w:rPr>
+        <w:t>:</w:t>
+      </w:r>
+      <w:r>
+        <w:rPr>
+          <w:rFonts w:cs="Courier New"/>
+          <w:sz w:val="28"/>
+          <w:szCs w:val="28"/>
+        </w:rPr>
+        <w:t xml:space="preserve"> Да</w:t>
+      </w:r>
+      <w:proofErr w:type="gramEnd"/>
+      <w:r>
+        <w:rPr>
+          <w:rFonts w:cs="Courier New"/>
+          <w:sz w:val="28"/>
+          <w:szCs w:val="28"/>
+        </w:rPr>
+        <w:t xml:space="preserve">, требуется 100% предоплата. В учебном прототипе делаем </w:t>
+      </w:r>
+      <w:r>
+        <w:rPr>
+          <w:rFonts w:cs="Courier New"/>
+          <w:b/>
+          <w:bCs/>
+          <w:sz w:val="28"/>
+          <w:szCs w:val="28"/>
+        </w:rPr>
+        <w:t>кнопку-заглушку «Оплатить»</w:t>
+      </w:r>
+      <w:r>
+        <w:rPr>
+          <w:rFonts w:cs="Courier New"/>
+          <w:sz w:val="28"/>
+          <w:szCs w:val="28"/>
+        </w:rPr>
+        <w:t>, которая моментально переводит бронь в статус «Оплачено».</w:t>
+      </w:r>
+    </w:p>
+    <w:p>
+      <w:pPr>
+        <w:pStyle w:val="a7"/>
+        <w:numPr>
+          <w:ilvl w:val="0"/>
+          <w:numId w:val="2"/>
+        </w:numPr>
+        <w:spacing w:after="0" w:line="360" w:lineRule="auto"/>
+        <w:jc w:val="both"/>
+        <w:rPr>
+          <w:rFonts w:cs="Courier New"/>
+          <w:sz w:val="28"/>
+          <w:szCs w:val="28"/>
+          <w:lang w:val="en-US"/>
+        </w:rPr>
+      </w:pPr>
+      <w:r>
+        <w:rPr>
+          <w:rFonts w:cs="Courier New"/>
+          <w:b/>
+          <w:bCs/>
+          <w:sz w:val="28"/>
+          <w:szCs w:val="28"/>
+        </w:rPr>
+        <w:t>Нужно ли уведомлять клиента о брони и напоминать о ней?</w:t>
+      </w:r>
+      <w:r>
+        <w:rPr>
+          <w:rFonts w:cs="Courier New"/>
+          <w:b/>
+          <w:bCs/>
+          <w:sz w:val="28"/>
+          <w:szCs w:val="28"/>
+        </w:rPr>
+        <w:t xml:space="preserve"> </w:t>
+      </w:r>
+      <w:proofErr w:type="gramStart"/>
+      <w:r>
+        <w:rPr>
+          <w:rFonts w:cs="Courier New"/>
+          <w:b/>
+          <w:bCs/>
+          <w:sz w:val="28"/>
+          <w:szCs w:val="28"/>
+        </w:rPr>
+        <w:t>Каким</w:t>
+      </w:r>
+      <w:proofErr w:type="gramEnd"/>
+      <w:r>
+        <w:rPr>
+          <w:rFonts w:cs="Courier New"/>
+          <w:b/>
+          <w:bCs/>
+          <w:sz w:val="28"/>
+          <w:szCs w:val="28"/>
+          <w:lang w:val="en-US"/>
+        </w:rPr>
+        <w:t xml:space="preserve"> </w:t>
+      </w:r>
+      <w:r>
+        <w:rPr>
+          <w:rFonts w:cs="Courier New"/>
+          <w:b/>
+          <w:bCs/>
+          <w:sz w:val="28"/>
+          <w:szCs w:val="28"/>
+        </w:rPr>
+        <w:t>каналом</w:t>
+      </w:r>
+      <w:r>
+        <w:rPr>
+          <w:rFonts w:cs="Courier New"/>
+          <w:b/>
+          <w:bCs/>
+          <w:sz w:val="28"/>
+          <w:szCs w:val="28"/>
+          <w:lang w:val="en-US"/>
+        </w:rPr>
+        <w:t>: SMS, Telegram, email?</w:t>
+      </w:r>
+    </w:p>
+    <w:p>
+      <w:pPr>
+        <w:spacing w:after="0" w:line="360" w:lineRule="auto"/>
+        <w:jc w:val="both"/>
+        <w:rPr>
+          <w:rFonts w:cs="Courier New"/>
+          <w:sz w:val="28"/>
+          <w:szCs w:val="28"/>
+        </w:rPr>
+      </w:pPr>
+      <w:r>
+        <w:rPr>
+          <w:rFonts w:cs="Courier New"/>
+          <w:i/>
+          <w:iCs/>
+          <w:sz w:val="28"/>
+          <w:szCs w:val="28"/>
+        </w:rPr>
+        <w:t>Ответ</w:t>
+      </w:r>
+      <w:proofErr w:type="gramStart"/>
+      <w:r>
+        <w:rPr>
+          <w:rFonts w:cs="Courier New"/>
+          <w:i/>
+          <w:iCs/>
+          <w:sz w:val="28"/>
+          <w:szCs w:val="28"/>
+        </w:rPr>
+        <w:t>:</w:t>
+      </w:r>
+      <w:r>
+        <w:rPr>
+          <w:rFonts w:cs="Courier New"/>
+          <w:sz w:val="28"/>
+          <w:szCs w:val="28"/>
+        </w:rPr>
+        <w:t xml:space="preserve"> Да</w:t>
+      </w:r>
+      <w:proofErr w:type="gramEnd"/>
+      <w:r>
+        <w:rPr>
+          <w:rFonts w:cs="Courier New"/>
+          <w:sz w:val="28"/>
+          <w:szCs w:val="28"/>
+        </w:rPr>
+        <w:t xml:space="preserve">, уведомления нужны, но делаем </w:t>
       </w:r>
       <w:r>
         <w:rPr>
@@ -1177,23 +1424,19 @@
     </w:p>
     <w:p>
       <w:pPr>
-        <w:spacing w:after="0" w:line="360" w:lineRule="auto"/>
-        <w:ind w:firstLine="709"/>
-        <w:jc w:val="both"/>
-        <w:rPr>
-          <w:rFonts w:cs="Courier New"/>
-          <w:sz w:val="28"/>
-          <w:szCs w:val="28"/>
-        </w:rPr>
-      </w:pPr>
-      <w:r>
-        <w:rPr>
-          <w:rFonts w:cs="Courier New"/>
-          <w:sz w:val="28"/>
-          <w:szCs w:val="28"/>
-        </w:rPr>
-        <w:t xml:space="preserve">16. </w:t>
-      </w:r>
+        <w:pStyle w:val="a7"/>
+        <w:numPr>
+          <w:ilvl w:val="0"/>
+          <w:numId w:val="2"/>
+        </w:numPr>
+        <w:spacing w:after="0" w:line="360" w:lineRule="auto"/>
+        <w:jc w:val="both"/>
+        <w:rPr>
+          <w:rFonts w:cs="Courier New"/>
+          <w:sz w:val="28"/>
+          <w:szCs w:val="28"/>
+        </w:rPr>
+      </w:pPr>
       <w:r>
         <w:rPr>
           <w:rFonts w:cs="Courier New"/>
@@ -1362,7 +1605,7 @@
   <w:abstractNum w:abstractNumId="1" w15:restartNumberingAfterBreak="0">
     <w:nsid w:val="72254B34"/>
     <w:multiLevelType w:val="multilevel"/>
-    <w:tmpl w:val="9556B39E"/>
+    <w:tmpl w:val="6EBE0F2E"/>
     <w:lvl w:ilvl="0">
       <w:start w:val="1"/>
       <w:numFmt w:val="decimal"/>
@@ -1374,6 +1617,10 @@
         </w:tabs>
         <w:ind w:left="720" w:hanging="360"/>
       </w:pPr>
+      <w:rPr>
+        <w:b/>
+        <w:bCs/>
+      </w:rPr>
     </w:lvl>
     <w:lvl w:ilvl="1">
       <w:start w:val="1"/>
@@ -2084,6 +2331,7 @@
   <w:style w:type="character" w:default="1" w:styleId="a0">
     <w:name w:val="Default Paragraph Font"/>
     <w:uiPriority w:val="1"/>
+    <w:semiHidden/>
     <w:unhideWhenUsed/>
   </w:style>
   <w:style w:type="table" w:default="1" w:styleId="a1">

</xml_diff>